<commit_message>
sop(general/computer-vision-engineer-jd): update JD wording
Nice-to-have items now read "Experience with 3D and depth sensing" and
"Experience in backend development".

Co-Authored-By: Claude Opus 5.5 <noreply@anthropic.com>
Claude-Session: https://claude.ai/code/session_01KBsTQwRoyD7wtmr1PrKPfN
</commit_message>
<xml_diff>
--- a/content/general/attachments/computer-vision-engineer-jd.docx
+++ b/content/general/attachments/computer-vision-engineer-jd.docx
@@ -198,7 +198,7 @@
         <w:spacing w:after="40"/>
       </w:pPr>
       <w:r>
-        <w:t>3D and depth sensing.</w:t>
+        <w:t>Experience with 3D and depth sensing.</w:t>
       </w:r>
     </w:p>
     <w:p>
@@ -216,7 +216,7 @@
         <w:spacing w:after="40"/>
       </w:pPr>
       <w:r>
-        <w:t>Backend development.</w:t>
+        <w:t>Experience in backend development.</w:t>
       </w:r>
     </w:p>
     <w:p>

</xml_diff>